<commit_message>
Updated 2024 data used for HIV cascade reference group meeting results
</commit_message>
<xml_diff>
--- a/HIV/docs/ART_analysis.docx
+++ b/HIV/docs/ART_analysis.docx
@@ -1615,8 +1615,8 @@
 </file>
 
 <file path=customXml/item1.xml><?xml version="1.0" encoding="utf-8"?>
-<ct:contentTypeSchema xmlns:ct="http://schemas.microsoft.com/office/2006/metadata/contentType" xmlns:ma="http://schemas.microsoft.com/office/2006/metadata/properties/metaAttributes" ct:_="" ma:_="" ma:contentTypeName="Document" ma:contentTypeID="0x010100DE67EE9C3B32F24C997F08FEDABFE4D4" ma:contentTypeVersion="16" ma:contentTypeDescription="Create a new document." ma:contentTypeScope="" ma:versionID="3e4e2b6b967e4da65d8133cee92abe94">
-  <xsd:schema xmlns:xsd="http://www.w3.org/2001/XMLSchema" xmlns:xs="http://www.w3.org/2001/XMLSchema" xmlns:p="http://schemas.microsoft.com/office/2006/metadata/properties" xmlns:ns2="e2d22f42-674e-4fc3-9806-bf5045c6d197" xmlns:ns3="32705bbd-d6e6-412c-a7e2-7411e947c69b" targetNamespace="http://schemas.microsoft.com/office/2006/metadata/properties" ma:root="true" ma:fieldsID="97e55825e84af7b8186f1bff9ca21f4b" ns2:_="" ns3:_="">
+<ct:contentTypeSchema xmlns:ct="http://schemas.microsoft.com/office/2006/metadata/contentType" xmlns:ma="http://schemas.microsoft.com/office/2006/metadata/properties/metaAttributes" ct:_="" ma:_="" ma:contentTypeName="Document" ma:contentTypeID="0x010100DE67EE9C3B32F24C997F08FEDABFE4D4" ma:contentTypeVersion="17" ma:contentTypeDescription="Create a new document." ma:contentTypeScope="" ma:versionID="d62851ee79ce09952123a0bf70c731b9">
+  <xsd:schema xmlns:xsd="http://www.w3.org/2001/XMLSchema" xmlns:xs="http://www.w3.org/2001/XMLSchema" xmlns:p="http://schemas.microsoft.com/office/2006/metadata/properties" xmlns:ns2="e2d22f42-674e-4fc3-9806-bf5045c6d197" xmlns:ns3="32705bbd-d6e6-412c-a7e2-7411e947c69b" targetNamespace="http://schemas.microsoft.com/office/2006/metadata/properties" ma:root="true" ma:fieldsID="905449c4b9e327aa3f566e7062bc0b7f" ns2:_="" ns3:_="">
     <xsd:import namespace="e2d22f42-674e-4fc3-9806-bf5045c6d197"/>
     <xsd:import namespace="32705bbd-d6e6-412c-a7e2-7411e947c69b"/>
     <xsd:element name="properties">
@@ -1640,6 +1640,7 @@
                 <xsd:element ref="ns2:lcf76f155ced4ddcb4097134ff3c332f" minOccurs="0"/>
                 <xsd:element ref="ns3:TaxCatchAll" minOccurs="0"/>
                 <xsd:element ref="ns2:MediaServiceObjectDetectorVersions" minOccurs="0"/>
+                <xsd:element ref="ns2:MediaServiceSearchProperties" minOccurs="0"/>
               </xsd:all>
             </xsd:complexType>
           </xsd:element>
@@ -1714,6 +1715,11 @@
     <xsd:element name="MediaServiceObjectDetectorVersions" ma:index="23" nillable="true" ma:displayName="MediaServiceObjectDetectorVersions" ma:description="" ma:hidden="true" ma:indexed="true" ma:internalName="MediaServiceObjectDetectorVersions" ma:readOnly="true">
       <xsd:simpleType>
         <xsd:restriction base="dms:Text"/>
+      </xsd:simpleType>
+    </xsd:element>
+    <xsd:element name="MediaServiceSearchProperties" ma:index="24" nillable="true" ma:displayName="MediaServiceSearchProperties" ma:hidden="true" ma:internalName="MediaServiceSearchProperties" ma:readOnly="true">
+      <xsd:simpleType>
+        <xsd:restriction base="dms:Note"/>
       </xsd:simpleType>
     </xsd:element>
   </xsd:schema>
@@ -1866,10 +1872,25 @@
 </FormTemplates>
 </file>
 
+<file path=customXml/item3.xml><?xml version="1.0" encoding="utf-8"?>
+<p:properties xmlns:p="http://schemas.microsoft.com/office/2006/metadata/properties" xmlns:xsi="http://www.w3.org/2001/XMLSchema-instance" xmlns:pc="http://schemas.microsoft.com/office/infopath/2007/PartnerControls">
+  <documentManagement>
+    <lcf76f155ced4ddcb4097134ff3c332f xmlns="e2d22f42-674e-4fc3-9806-bf5045c6d197">
+      <Terms xmlns="http://schemas.microsoft.com/office/infopath/2007/PartnerControls"/>
+    </lcf76f155ced4ddcb4097134ff3c332f>
+    <TaxCatchAll xmlns="32705bbd-d6e6-412c-a7e2-7411e947c69b" xsi:nil="true"/>
+  </documentManagement>
+</p:properties>
+</file>
+
 <file path=customXml/itemProps1.xml><?xml version="1.0" encoding="utf-8"?>
-<ds:datastoreItem xmlns:ds="http://schemas.openxmlformats.org/officeDocument/2006/customXml" ds:itemID="{74FB5D0F-4048-4D46-9ED5-932410BF74B8}"/>
+<ds:datastoreItem xmlns:ds="http://schemas.openxmlformats.org/officeDocument/2006/customXml" ds:itemID="{042C4717-B6DC-43C0-9E7D-B41B13BB26BA}"/>
 </file>
 
 <file path=customXml/itemProps2.xml><?xml version="1.0" encoding="utf-8"?>
 <ds:datastoreItem xmlns:ds="http://schemas.openxmlformats.org/officeDocument/2006/customXml" ds:itemID="{A7702C61-99CC-46DD-920F-6102444D13B2}"/>
+</file>
+
+<file path=customXml/itemProps3.xml><?xml version="1.0" encoding="utf-8"?>
+<ds:datastoreItem xmlns:ds="http://schemas.openxmlformats.org/officeDocument/2006/customXml" ds:itemID="{E175D898-53A5-4AFD-9D9B-7861950EE73E}"/>
 </file>
</xml_diff>